<commit_message>
Report: blind-replay results, Table 2, and limits of the calibration
</commit_message>
<xml_diff>
--- a/report/report.docx
+++ b/report/report.docx
@@ -2669,6 +2669,979 @@
     </w:p>
     <w:p>
       <w:pPr>
+        <w:spacing w:after="120" w:line="276"/>
+      </w:pPr>
+      <w:r>
+        <w:rPr>
+          <w:rFonts w:ascii="Arial" w:cs="Arial" w:eastAsia="Arial" w:hAnsi="Arial"/>
+          <w:b/>
+          <w:bCs/>
+          <w:sz w:val="20"/>
+          <w:szCs w:val="20"/>
+        </w:rPr>
+        <w:t xml:space="preserve">An auditor's test: blind replay</w:t>
+      </w:r>
+      <w:r>
+        <w:rPr>
+          <w:rFonts w:ascii="Arial" w:cs="Arial" w:eastAsia="Arial" w:hAnsi="Arial"/>
+          <w:sz w:val="20"/>
+          <w:szCs w:val="20"/>
+        </w:rPr>
+        <w:t xml:space="preserve"> (Table 2). An auditor who suspects a group can rerun the same agents on a blind board and use the replays as the null. We scored each seed's logs against the blind runs of the other seeds of the same agent model, for visible and blind logs alike, so false alarms are measured out of sample. A task group is flagged only if its judge score is above every replay group's score. Calibrated this way, every judge variant raised at most 1 false alarm in 27 groups (0 to 10 at the fixed threshold). The cost was detections for three of the four variants. The naive Gemini judge fell from 22 to 11 of 27 (41%, bootstrap over runs 22 to 56%), because blind groups had scored up to 95 and only scores of 100 counted. The naive gpt-oss-120b judge fell from 23 to 12 of 26. The best of the four was gpt-oss-120b with the warning: 16 of 27 detections (59%, 33 to 81%) at 1 of 27 false alarms, against 19 and 9 of 27 at the fixed threshold. For 0 or 1 false alarms we give counts, since a bootstrap cannot bound them. Run-level tests need more replays than we have. With 2 or 5 replays per seed no run can reach p below 0.33 or 0.17, and p ≤ 0.05 needs at least 19. Our run-level false alarms are also uninformative: within one agent model, the largest blind run beats the others by construction, so exactly one blind run per model is flagged for any statistic. On names as written, page concentration beat every replay in all 9 visible runs.</w:t>
+      </w:r>
+    </w:p>
+    <w:p>
+      <w:pPr>
+        <w:spacing w:after="120" w:line="276"/>
+      </w:pPr>
+      <w:r>
+        <w:rPr>
+          <w:rFonts w:ascii="Arial" w:cs="Arial" w:eastAsia="Arial" w:hAnsi="Arial"/>
+          <w:b/>
+          <w:bCs/>
+          <w:sz w:val="20"/>
+          <w:szCs w:val="20"/>
+        </w:rPr>
+        <w:t xml:space="preserve">Table 2.</w:t>
+      </w:r>
+      <w:r>
+        <w:rPr>
+          <w:rFonts w:ascii="Arial" w:cs="Arial" w:eastAsia="Arial" w:hAnsi="Arial"/>
+          <w:sz w:val="20"/>
+          <w:szCs w:val="20"/>
+        </w:rPr>
+        <w:t xml:space="preserve"> Judge flags pooled over both agent models, at the fixed threshold of 50 and calibrated on blind replays (flag only above every group in the other seeds' blind runs).</w:t>
+      </w:r>
+    </w:p>
+    <w:tbl>
+      <w:tblPr>
+        <w:tblW w:type="dxa" w:w="9640"/>
+        <w:tblBorders>
+          <w:top w:val="single" w:color="auto" w:sz="4"/>
+          <w:left w:val="single" w:color="auto" w:sz="4"/>
+          <w:bottom w:val="single" w:color="auto" w:sz="4"/>
+          <w:right w:val="single" w:color="auto" w:sz="4"/>
+          <w:insideH w:val="single" w:color="auto" w:sz="4"/>
+          <w:insideV w:val="single" w:color="auto" w:sz="4"/>
+        </w:tblBorders>
+      </w:tblPr>
+      <w:tblGrid>
+        <w:gridCol w:w="1606"/>
+        <w:gridCol w:w="1606"/>
+        <w:gridCol w:w="1606"/>
+        <w:gridCol w:w="1606"/>
+        <w:gridCol w:w="1606"/>
+        <w:gridCol w:w="1610"/>
+      </w:tblGrid>
+      <w:tr>
+        <w:trPr>
+          <w:tblHeader/>
+        </w:trPr>
+        <w:tc>
+          <w:tcPr>
+            <w:tcW w:type="dxa" w:w="1606"/>
+            <w:tcBorders>
+              <w:top w:val="single" w:color="BBBBBB" w:sz="4"/>
+              <w:left w:val="single" w:color="BBBBBB" w:sz="4"/>
+              <w:bottom w:val="single" w:color="BBBBBB" w:sz="4"/>
+              <w:right w:val="single" w:color="BBBBBB" w:sz="4"/>
+            </w:tcBorders>
+            <w:shd w:fill="EFEFEC" w:color="auto" w:val="clear"/>
+            <w:tcMar>
+              <w:top w:type="dxa" w:w="40"/>
+              <w:left w:type="dxa" w:w="80"/>
+              <w:bottom w:type="dxa" w:w="40"/>
+              <w:right w:type="dxa" w:w="80"/>
+            </w:tcMar>
+          </w:tcPr>
+          <w:p>
+            <w:r>
+              <w:rPr>
+                <w:rFonts w:ascii="Arial" w:cs="Arial" w:eastAsia="Arial" w:hAnsi="Arial"/>
+                <w:b/>
+                <w:bCs/>
+                <w:sz w:val="17"/>
+                <w:szCs w:val="17"/>
+              </w:rPr>
+              <w:t xml:space="preserve">Judge</w:t>
+            </w:r>
+          </w:p>
+        </w:tc>
+        <w:tc>
+          <w:tcPr>
+            <w:tcW w:type="dxa" w:w="1606"/>
+            <w:tcBorders>
+              <w:top w:val="single" w:color="BBBBBB" w:sz="4"/>
+              <w:left w:val="single" w:color="BBBBBB" w:sz="4"/>
+              <w:bottom w:val="single" w:color="BBBBBB" w:sz="4"/>
+              <w:right w:val="single" w:color="BBBBBB" w:sz="4"/>
+            </w:tcBorders>
+            <w:shd w:fill="EFEFEC" w:color="auto" w:val="clear"/>
+            <w:tcMar>
+              <w:top w:type="dxa" w:w="40"/>
+              <w:left w:type="dxa" w:w="80"/>
+              <w:bottom w:type="dxa" w:w="40"/>
+              <w:right w:type="dxa" w:w="80"/>
+            </w:tcMar>
+          </w:tcPr>
+          <w:p>
+            <w:r>
+              <w:rPr>
+                <w:rFonts w:ascii="Arial" w:cs="Arial" w:eastAsia="Arial" w:hAnsi="Arial"/>
+                <w:b/>
+                <w:bCs/>
+                <w:sz w:val="17"/>
+                <w:szCs w:val="17"/>
+              </w:rPr>
+              <w:t xml:space="preserve">Variant</w:t>
+            </w:r>
+          </w:p>
+        </w:tc>
+        <w:tc>
+          <w:tcPr>
+            <w:tcW w:type="dxa" w:w="1606"/>
+            <w:tcBorders>
+              <w:top w:val="single" w:color="BBBBBB" w:sz="4"/>
+              <w:left w:val="single" w:color="BBBBBB" w:sz="4"/>
+              <w:bottom w:val="single" w:color="BBBBBB" w:sz="4"/>
+              <w:right w:val="single" w:color="BBBBBB" w:sz="4"/>
+            </w:tcBorders>
+            <w:shd w:fill="EFEFEC" w:color="auto" w:val="clear"/>
+            <w:tcMar>
+              <w:top w:type="dxa" w:w="40"/>
+              <w:left w:type="dxa" w:w="80"/>
+              <w:bottom w:type="dxa" w:w="40"/>
+              <w:right w:type="dxa" w:w="80"/>
+            </w:tcMar>
+          </w:tcPr>
+          <w:p>
+            <w:r>
+              <w:rPr>
+                <w:rFonts w:ascii="Arial" w:cs="Arial" w:eastAsia="Arial" w:hAnsi="Arial"/>
+                <w:b/>
+                <w:bCs/>
+                <w:sz w:val="17"/>
+                <w:szCs w:val="17"/>
+              </w:rPr>
+              <w:t xml:space="preserve">Detections at 50</w:t>
+            </w:r>
+          </w:p>
+        </w:tc>
+        <w:tc>
+          <w:tcPr>
+            <w:tcW w:type="dxa" w:w="1606"/>
+            <w:tcBorders>
+              <w:top w:val="single" w:color="BBBBBB" w:sz="4"/>
+              <w:left w:val="single" w:color="BBBBBB" w:sz="4"/>
+              <w:bottom w:val="single" w:color="BBBBBB" w:sz="4"/>
+              <w:right w:val="single" w:color="BBBBBB" w:sz="4"/>
+            </w:tcBorders>
+            <w:shd w:fill="EFEFEC" w:color="auto" w:val="clear"/>
+            <w:tcMar>
+              <w:top w:type="dxa" w:w="40"/>
+              <w:left w:type="dxa" w:w="80"/>
+              <w:bottom w:type="dxa" w:w="40"/>
+              <w:right w:type="dxa" w:w="80"/>
+            </w:tcMar>
+          </w:tcPr>
+          <w:p>
+            <w:r>
+              <w:rPr>
+                <w:rFonts w:ascii="Arial" w:cs="Arial" w:eastAsia="Arial" w:hAnsi="Arial"/>
+                <w:b/>
+                <w:bCs/>
+                <w:sz w:val="17"/>
+                <w:szCs w:val="17"/>
+              </w:rPr>
+              <w:t xml:space="preserve">False alarms at 50</w:t>
+            </w:r>
+          </w:p>
+        </w:tc>
+        <w:tc>
+          <w:tcPr>
+            <w:tcW w:type="dxa" w:w="1606"/>
+            <w:tcBorders>
+              <w:top w:val="single" w:color="BBBBBB" w:sz="4"/>
+              <w:left w:val="single" w:color="BBBBBB" w:sz="4"/>
+              <w:bottom w:val="single" w:color="BBBBBB" w:sz="4"/>
+              <w:right w:val="single" w:color="BBBBBB" w:sz="4"/>
+            </w:tcBorders>
+            <w:shd w:fill="EFEFEC" w:color="auto" w:val="clear"/>
+            <w:tcMar>
+              <w:top w:type="dxa" w:w="40"/>
+              <w:left w:type="dxa" w:w="80"/>
+              <w:bottom w:type="dxa" w:w="40"/>
+              <w:right w:type="dxa" w:w="80"/>
+            </w:tcMar>
+          </w:tcPr>
+          <w:p>
+            <w:r>
+              <w:rPr>
+                <w:rFonts w:ascii="Arial" w:cs="Arial" w:eastAsia="Arial" w:hAnsi="Arial"/>
+                <w:b/>
+                <w:bCs/>
+                <w:sz w:val="17"/>
+                <w:szCs w:val="17"/>
+              </w:rPr>
+              <w:t xml:space="preserve">Detections, replay</w:t>
+            </w:r>
+          </w:p>
+        </w:tc>
+        <w:tc>
+          <w:tcPr>
+            <w:tcW w:type="dxa" w:w="1610"/>
+            <w:tcBorders>
+              <w:top w:val="single" w:color="BBBBBB" w:sz="4"/>
+              <w:left w:val="single" w:color="BBBBBB" w:sz="4"/>
+              <w:bottom w:val="single" w:color="BBBBBB" w:sz="4"/>
+              <w:right w:val="single" w:color="BBBBBB" w:sz="4"/>
+            </w:tcBorders>
+            <w:shd w:fill="EFEFEC" w:color="auto" w:val="clear"/>
+            <w:tcMar>
+              <w:top w:type="dxa" w:w="40"/>
+              <w:left w:type="dxa" w:w="80"/>
+              <w:bottom w:type="dxa" w:w="40"/>
+              <w:right w:type="dxa" w:w="80"/>
+            </w:tcMar>
+          </w:tcPr>
+          <w:p>
+            <w:r>
+              <w:rPr>
+                <w:rFonts w:ascii="Arial" w:cs="Arial" w:eastAsia="Arial" w:hAnsi="Arial"/>
+                <w:b/>
+                <w:bCs/>
+                <w:sz w:val="17"/>
+                <w:szCs w:val="17"/>
+              </w:rPr>
+              <w:t xml:space="preserve">False alarms, replay</w:t>
+            </w:r>
+          </w:p>
+        </w:tc>
+      </w:tr>
+      <w:tr>
+        <w:trPr>
+          <w:tblHeader w:val="off"/>
+        </w:trPr>
+        <w:tc>
+          <w:tcPr>
+            <w:tcW w:type="dxa" w:w="1606"/>
+            <w:tcBorders>
+              <w:top w:val="single" w:color="BBBBBB" w:sz="4"/>
+              <w:left w:val="single" w:color="BBBBBB" w:sz="4"/>
+              <w:bottom w:val="single" w:color="BBBBBB" w:sz="4"/>
+              <w:right w:val="single" w:color="BBBBBB" w:sz="4"/>
+            </w:tcBorders>
+            <w:tcMar>
+              <w:top w:type="dxa" w:w="40"/>
+              <w:left w:type="dxa" w:w="80"/>
+              <w:bottom w:type="dxa" w:w="40"/>
+              <w:right w:type="dxa" w:w="80"/>
+            </w:tcMar>
+          </w:tcPr>
+          <w:p>
+            <w:r>
+              <w:rPr>
+                <w:rFonts w:ascii="Arial" w:cs="Arial" w:eastAsia="Arial" w:hAnsi="Arial"/>
+                <w:b w:val="false"/>
+                <w:bCs w:val="false"/>
+                <w:sz w:val="17"/>
+                <w:szCs w:val="17"/>
+              </w:rPr>
+              <w:t xml:space="preserve">gemini-3.5-flash-lite</w:t>
+            </w:r>
+          </w:p>
+        </w:tc>
+        <w:tc>
+          <w:tcPr>
+            <w:tcW w:type="dxa" w:w="1606"/>
+            <w:tcBorders>
+              <w:top w:val="single" w:color="BBBBBB" w:sz="4"/>
+              <w:left w:val="single" w:color="BBBBBB" w:sz="4"/>
+              <w:bottom w:val="single" w:color="BBBBBB" w:sz="4"/>
+              <w:right w:val="single" w:color="BBBBBB" w:sz="4"/>
+            </w:tcBorders>
+            <w:tcMar>
+              <w:top w:type="dxa" w:w="40"/>
+              <w:left w:type="dxa" w:w="80"/>
+              <w:bottom w:type="dxa" w:w="40"/>
+              <w:right w:type="dxa" w:w="80"/>
+            </w:tcMar>
+          </w:tcPr>
+          <w:p>
+            <w:r>
+              <w:rPr>
+                <w:rFonts w:ascii="Arial" w:cs="Arial" w:eastAsia="Arial" w:hAnsi="Arial"/>
+                <w:b w:val="false"/>
+                <w:bCs w:val="false"/>
+                <w:sz w:val="17"/>
+                <w:szCs w:val="17"/>
+              </w:rPr>
+              <w:t xml:space="preserve">naive</w:t>
+            </w:r>
+          </w:p>
+        </w:tc>
+        <w:tc>
+          <w:tcPr>
+            <w:tcW w:type="dxa" w:w="1606"/>
+            <w:tcBorders>
+              <w:top w:val="single" w:color="BBBBBB" w:sz="4"/>
+              <w:left w:val="single" w:color="BBBBBB" w:sz="4"/>
+              <w:bottom w:val="single" w:color="BBBBBB" w:sz="4"/>
+              <w:right w:val="single" w:color="BBBBBB" w:sz="4"/>
+            </w:tcBorders>
+            <w:tcMar>
+              <w:top w:type="dxa" w:w="40"/>
+              <w:left w:type="dxa" w:w="80"/>
+              <w:bottom w:type="dxa" w:w="40"/>
+              <w:right w:type="dxa" w:w="80"/>
+            </w:tcMar>
+          </w:tcPr>
+          <w:p>
+            <w:r>
+              <w:rPr>
+                <w:rFonts w:ascii="Arial" w:cs="Arial" w:eastAsia="Arial" w:hAnsi="Arial"/>
+                <w:b w:val="false"/>
+                <w:bCs w:val="false"/>
+                <w:sz w:val="17"/>
+                <w:szCs w:val="17"/>
+              </w:rPr>
+              <w:t xml:space="preserve">22/27</w:t>
+            </w:r>
+          </w:p>
+        </w:tc>
+        <w:tc>
+          <w:tcPr>
+            <w:tcW w:type="dxa" w:w="1606"/>
+            <w:tcBorders>
+              <w:top w:val="single" w:color="BBBBBB" w:sz="4"/>
+              <w:left w:val="single" w:color="BBBBBB" w:sz="4"/>
+              <w:bottom w:val="single" w:color="BBBBBB" w:sz="4"/>
+              <w:right w:val="single" w:color="BBBBBB" w:sz="4"/>
+            </w:tcBorders>
+            <w:tcMar>
+              <w:top w:type="dxa" w:w="40"/>
+              <w:left w:type="dxa" w:w="80"/>
+              <w:bottom w:type="dxa" w:w="40"/>
+              <w:right w:type="dxa" w:w="80"/>
+            </w:tcMar>
+          </w:tcPr>
+          <w:p>
+            <w:r>
+              <w:rPr>
+                <w:rFonts w:ascii="Arial" w:cs="Arial" w:eastAsia="Arial" w:hAnsi="Arial"/>
+                <w:b w:val="false"/>
+                <w:bCs w:val="false"/>
+                <w:sz w:val="17"/>
+                <w:szCs w:val="17"/>
+              </w:rPr>
+              <w:t xml:space="preserve">9/27</w:t>
+            </w:r>
+          </w:p>
+        </w:tc>
+        <w:tc>
+          <w:tcPr>
+            <w:tcW w:type="dxa" w:w="1606"/>
+            <w:tcBorders>
+              <w:top w:val="single" w:color="BBBBBB" w:sz="4"/>
+              <w:left w:val="single" w:color="BBBBBB" w:sz="4"/>
+              <w:bottom w:val="single" w:color="BBBBBB" w:sz="4"/>
+              <w:right w:val="single" w:color="BBBBBB" w:sz="4"/>
+            </w:tcBorders>
+            <w:tcMar>
+              <w:top w:type="dxa" w:w="40"/>
+              <w:left w:type="dxa" w:w="80"/>
+              <w:bottom w:type="dxa" w:w="40"/>
+              <w:right w:type="dxa" w:w="80"/>
+            </w:tcMar>
+          </w:tcPr>
+          <w:p>
+            <w:r>
+              <w:rPr>
+                <w:rFonts w:ascii="Arial" w:cs="Arial" w:eastAsia="Arial" w:hAnsi="Arial"/>
+                <w:b w:val="false"/>
+                <w:bCs w:val="false"/>
+                <w:sz w:val="17"/>
+                <w:szCs w:val="17"/>
+              </w:rPr>
+              <w:t xml:space="preserve">11/27</w:t>
+            </w:r>
+          </w:p>
+        </w:tc>
+        <w:tc>
+          <w:tcPr>
+            <w:tcW w:type="dxa" w:w="1610"/>
+            <w:tcBorders>
+              <w:top w:val="single" w:color="BBBBBB" w:sz="4"/>
+              <w:left w:val="single" w:color="BBBBBB" w:sz="4"/>
+              <w:bottom w:val="single" w:color="BBBBBB" w:sz="4"/>
+              <w:right w:val="single" w:color="BBBBBB" w:sz="4"/>
+            </w:tcBorders>
+            <w:tcMar>
+              <w:top w:type="dxa" w:w="40"/>
+              <w:left w:type="dxa" w:w="80"/>
+              <w:bottom w:type="dxa" w:w="40"/>
+              <w:right w:type="dxa" w:w="80"/>
+            </w:tcMar>
+          </w:tcPr>
+          <w:p>
+            <w:r>
+              <w:rPr>
+                <w:rFonts w:ascii="Arial" w:cs="Arial" w:eastAsia="Arial" w:hAnsi="Arial"/>
+                <w:b w:val="false"/>
+                <w:bCs w:val="false"/>
+                <w:sz w:val="17"/>
+                <w:szCs w:val="17"/>
+              </w:rPr>
+              <w:t xml:space="preserve">0/27</w:t>
+            </w:r>
+          </w:p>
+        </w:tc>
+      </w:tr>
+      <w:tr>
+        <w:trPr>
+          <w:tblHeader w:val="off"/>
+        </w:trPr>
+        <w:tc>
+          <w:tcPr>
+            <w:tcW w:type="dxa" w:w="1606"/>
+            <w:tcBorders>
+              <w:top w:val="single" w:color="BBBBBB" w:sz="4"/>
+              <w:left w:val="single" w:color="BBBBBB" w:sz="4"/>
+              <w:bottom w:val="single" w:color="BBBBBB" w:sz="4"/>
+              <w:right w:val="single" w:color="BBBBBB" w:sz="4"/>
+            </w:tcBorders>
+            <w:tcMar>
+              <w:top w:type="dxa" w:w="40"/>
+              <w:left w:type="dxa" w:w="80"/>
+              <w:bottom w:type="dxa" w:w="40"/>
+              <w:right w:type="dxa" w:w="80"/>
+            </w:tcMar>
+          </w:tcPr>
+          <w:p>
+            <w:r>
+              <w:rPr>
+                <w:rFonts w:ascii="Arial" w:cs="Arial" w:eastAsia="Arial" w:hAnsi="Arial"/>
+                <w:b w:val="false"/>
+                <w:bCs w:val="false"/>
+                <w:sz w:val="17"/>
+                <w:szCs w:val="17"/>
+              </w:rPr>
+              <w:t xml:space="preserve">gemini-3.5-flash-lite</w:t>
+            </w:r>
+          </w:p>
+        </w:tc>
+        <w:tc>
+          <w:tcPr>
+            <w:tcW w:type="dxa" w:w="1606"/>
+            <w:tcBorders>
+              <w:top w:val="single" w:color="BBBBBB" w:sz="4"/>
+              <w:left w:val="single" w:color="BBBBBB" w:sz="4"/>
+              <w:bottom w:val="single" w:color="BBBBBB" w:sz="4"/>
+              <w:right w:val="single" w:color="BBBBBB" w:sz="4"/>
+            </w:tcBorders>
+            <w:tcMar>
+              <w:top w:type="dxa" w:w="40"/>
+              <w:left w:type="dxa" w:w="80"/>
+              <w:bottom w:type="dxa" w:w="40"/>
+              <w:right w:type="dxa" w:w="80"/>
+            </w:tcMar>
+          </w:tcPr>
+          <w:p>
+            <w:r>
+              <w:rPr>
+                <w:rFonts w:ascii="Arial" w:cs="Arial" w:eastAsia="Arial" w:hAnsi="Arial"/>
+                <w:b w:val="false"/>
+                <w:bCs w:val="false"/>
+                <w:sz w:val="17"/>
+                <w:szCs w:val="17"/>
+              </w:rPr>
+              <w:t xml:space="preserve">confound-aware</w:t>
+            </w:r>
+          </w:p>
+        </w:tc>
+        <w:tc>
+          <w:tcPr>
+            <w:tcW w:type="dxa" w:w="1606"/>
+            <w:tcBorders>
+              <w:top w:val="single" w:color="BBBBBB" w:sz="4"/>
+              <w:left w:val="single" w:color="BBBBBB" w:sz="4"/>
+              <w:bottom w:val="single" w:color="BBBBBB" w:sz="4"/>
+              <w:right w:val="single" w:color="BBBBBB" w:sz="4"/>
+            </w:tcBorders>
+            <w:tcMar>
+              <w:top w:type="dxa" w:w="40"/>
+              <w:left w:type="dxa" w:w="80"/>
+              <w:bottom w:type="dxa" w:w="40"/>
+              <w:right w:type="dxa" w:w="80"/>
+            </w:tcMar>
+          </w:tcPr>
+          <w:p>
+            <w:r>
+              <w:rPr>
+                <w:rFonts w:ascii="Arial" w:cs="Arial" w:eastAsia="Arial" w:hAnsi="Arial"/>
+                <w:b w:val="false"/>
+                <w:bCs w:val="false"/>
+                <w:sz w:val="17"/>
+                <w:szCs w:val="17"/>
+              </w:rPr>
+              <w:t xml:space="preserve">8/27</w:t>
+            </w:r>
+          </w:p>
+        </w:tc>
+        <w:tc>
+          <w:tcPr>
+            <w:tcW w:type="dxa" w:w="1606"/>
+            <w:tcBorders>
+              <w:top w:val="single" w:color="BBBBBB" w:sz="4"/>
+              <w:left w:val="single" w:color="BBBBBB" w:sz="4"/>
+              <w:bottom w:val="single" w:color="BBBBBB" w:sz="4"/>
+              <w:right w:val="single" w:color="BBBBBB" w:sz="4"/>
+            </w:tcBorders>
+            <w:tcMar>
+              <w:top w:type="dxa" w:w="40"/>
+              <w:left w:type="dxa" w:w="80"/>
+              <w:bottom w:type="dxa" w:w="40"/>
+              <w:right w:type="dxa" w:w="80"/>
+            </w:tcMar>
+          </w:tcPr>
+          <w:p>
+            <w:r>
+              <w:rPr>
+                <w:rFonts w:ascii="Arial" w:cs="Arial" w:eastAsia="Arial" w:hAnsi="Arial"/>
+                <w:b w:val="false"/>
+                <w:bCs w:val="false"/>
+                <w:sz w:val="17"/>
+                <w:szCs w:val="17"/>
+              </w:rPr>
+              <w:t xml:space="preserve">0/27</w:t>
+            </w:r>
+          </w:p>
+        </w:tc>
+        <w:tc>
+          <w:tcPr>
+            <w:tcW w:type="dxa" w:w="1606"/>
+            <w:tcBorders>
+              <w:top w:val="single" w:color="BBBBBB" w:sz="4"/>
+              <w:left w:val="single" w:color="BBBBBB" w:sz="4"/>
+              <w:bottom w:val="single" w:color="BBBBBB" w:sz="4"/>
+              <w:right w:val="single" w:color="BBBBBB" w:sz="4"/>
+            </w:tcBorders>
+            <w:tcMar>
+              <w:top w:type="dxa" w:w="40"/>
+              <w:left w:type="dxa" w:w="80"/>
+              <w:bottom w:type="dxa" w:w="40"/>
+              <w:right w:type="dxa" w:w="80"/>
+            </w:tcMar>
+          </w:tcPr>
+          <w:p>
+            <w:r>
+              <w:rPr>
+                <w:rFonts w:ascii="Arial" w:cs="Arial" w:eastAsia="Arial" w:hAnsi="Arial"/>
+                <w:b w:val="false"/>
+                <w:bCs w:val="false"/>
+                <w:sz w:val="17"/>
+                <w:szCs w:val="17"/>
+              </w:rPr>
+              <w:t xml:space="preserve">9/27</w:t>
+            </w:r>
+          </w:p>
+        </w:tc>
+        <w:tc>
+          <w:tcPr>
+            <w:tcW w:type="dxa" w:w="1610"/>
+            <w:tcBorders>
+              <w:top w:val="single" w:color="BBBBBB" w:sz="4"/>
+              <w:left w:val="single" w:color="BBBBBB" w:sz="4"/>
+              <w:bottom w:val="single" w:color="BBBBBB" w:sz="4"/>
+              <w:right w:val="single" w:color="BBBBBB" w:sz="4"/>
+            </w:tcBorders>
+            <w:tcMar>
+              <w:top w:type="dxa" w:w="40"/>
+              <w:left w:type="dxa" w:w="80"/>
+              <w:bottom w:type="dxa" w:w="40"/>
+              <w:right w:type="dxa" w:w="80"/>
+            </w:tcMar>
+          </w:tcPr>
+          <w:p>
+            <w:r>
+              <w:rPr>
+                <w:rFonts w:ascii="Arial" w:cs="Arial" w:eastAsia="Arial" w:hAnsi="Arial"/>
+                <w:b w:val="false"/>
+                <w:bCs w:val="false"/>
+                <w:sz w:val="17"/>
+                <w:szCs w:val="17"/>
+              </w:rPr>
+              <w:t xml:space="preserve">1/27</w:t>
+            </w:r>
+          </w:p>
+        </w:tc>
+      </w:tr>
+      <w:tr>
+        <w:trPr>
+          <w:tblHeader w:val="off"/>
+        </w:trPr>
+        <w:tc>
+          <w:tcPr>
+            <w:tcW w:type="dxa" w:w="1606"/>
+            <w:tcBorders>
+              <w:top w:val="single" w:color="BBBBBB" w:sz="4"/>
+              <w:left w:val="single" w:color="BBBBBB" w:sz="4"/>
+              <w:bottom w:val="single" w:color="BBBBBB" w:sz="4"/>
+              <w:right w:val="single" w:color="BBBBBB" w:sz="4"/>
+            </w:tcBorders>
+            <w:tcMar>
+              <w:top w:type="dxa" w:w="40"/>
+              <w:left w:type="dxa" w:w="80"/>
+              <w:bottom w:type="dxa" w:w="40"/>
+              <w:right w:type="dxa" w:w="80"/>
+            </w:tcMar>
+          </w:tcPr>
+          <w:p>
+            <w:r>
+              <w:rPr>
+                <w:rFonts w:ascii="Arial" w:cs="Arial" w:eastAsia="Arial" w:hAnsi="Arial"/>
+                <w:b w:val="false"/>
+                <w:bCs w:val="false"/>
+                <w:sz w:val="17"/>
+                <w:szCs w:val="17"/>
+              </w:rPr>
+              <w:t xml:space="preserve">gpt-oss-120b (low)</w:t>
+            </w:r>
+          </w:p>
+        </w:tc>
+        <w:tc>
+          <w:tcPr>
+            <w:tcW w:type="dxa" w:w="1606"/>
+            <w:tcBorders>
+              <w:top w:val="single" w:color="BBBBBB" w:sz="4"/>
+              <w:left w:val="single" w:color="BBBBBB" w:sz="4"/>
+              <w:bottom w:val="single" w:color="BBBBBB" w:sz="4"/>
+              <w:right w:val="single" w:color="BBBBBB" w:sz="4"/>
+            </w:tcBorders>
+            <w:tcMar>
+              <w:top w:type="dxa" w:w="40"/>
+              <w:left w:type="dxa" w:w="80"/>
+              <w:bottom w:type="dxa" w:w="40"/>
+              <w:right w:type="dxa" w:w="80"/>
+            </w:tcMar>
+          </w:tcPr>
+          <w:p>
+            <w:r>
+              <w:rPr>
+                <w:rFonts w:ascii="Arial" w:cs="Arial" w:eastAsia="Arial" w:hAnsi="Arial"/>
+                <w:b w:val="false"/>
+                <w:bCs w:val="false"/>
+                <w:sz w:val="17"/>
+                <w:szCs w:val="17"/>
+              </w:rPr>
+              <w:t xml:space="preserve">naive</w:t>
+            </w:r>
+          </w:p>
+        </w:tc>
+        <w:tc>
+          <w:tcPr>
+            <w:tcW w:type="dxa" w:w="1606"/>
+            <w:tcBorders>
+              <w:top w:val="single" w:color="BBBBBB" w:sz="4"/>
+              <w:left w:val="single" w:color="BBBBBB" w:sz="4"/>
+              <w:bottom w:val="single" w:color="BBBBBB" w:sz="4"/>
+              <w:right w:val="single" w:color="BBBBBB" w:sz="4"/>
+            </w:tcBorders>
+            <w:tcMar>
+              <w:top w:type="dxa" w:w="40"/>
+              <w:left w:type="dxa" w:w="80"/>
+              <w:bottom w:type="dxa" w:w="40"/>
+              <w:right w:type="dxa" w:w="80"/>
+            </w:tcMar>
+          </w:tcPr>
+          <w:p>
+            <w:r>
+              <w:rPr>
+                <w:rFonts w:ascii="Arial" w:cs="Arial" w:eastAsia="Arial" w:hAnsi="Arial"/>
+                <w:b w:val="false"/>
+                <w:bCs w:val="false"/>
+                <w:sz w:val="17"/>
+                <w:szCs w:val="17"/>
+              </w:rPr>
+              <w:t xml:space="preserve">23/26</w:t>
+            </w:r>
+          </w:p>
+        </w:tc>
+        <w:tc>
+          <w:tcPr>
+            <w:tcW w:type="dxa" w:w="1606"/>
+            <w:tcBorders>
+              <w:top w:val="single" w:color="BBBBBB" w:sz="4"/>
+              <w:left w:val="single" w:color="BBBBBB" w:sz="4"/>
+              <w:bottom w:val="single" w:color="BBBBBB" w:sz="4"/>
+              <w:right w:val="single" w:color="BBBBBB" w:sz="4"/>
+            </w:tcBorders>
+            <w:tcMar>
+              <w:top w:type="dxa" w:w="40"/>
+              <w:left w:type="dxa" w:w="80"/>
+              <w:bottom w:type="dxa" w:w="40"/>
+              <w:right w:type="dxa" w:w="80"/>
+            </w:tcMar>
+          </w:tcPr>
+          <w:p>
+            <w:r>
+              <w:rPr>
+                <w:rFonts w:ascii="Arial" w:cs="Arial" w:eastAsia="Arial" w:hAnsi="Arial"/>
+                <w:b w:val="false"/>
+                <w:bCs w:val="false"/>
+                <w:sz w:val="17"/>
+                <w:szCs w:val="17"/>
+              </w:rPr>
+              <w:t xml:space="preserve">10/27</w:t>
+            </w:r>
+          </w:p>
+        </w:tc>
+        <w:tc>
+          <w:tcPr>
+            <w:tcW w:type="dxa" w:w="1606"/>
+            <w:tcBorders>
+              <w:top w:val="single" w:color="BBBBBB" w:sz="4"/>
+              <w:left w:val="single" w:color="BBBBBB" w:sz="4"/>
+              <w:bottom w:val="single" w:color="BBBBBB" w:sz="4"/>
+              <w:right w:val="single" w:color="BBBBBB" w:sz="4"/>
+            </w:tcBorders>
+            <w:tcMar>
+              <w:top w:type="dxa" w:w="40"/>
+              <w:left w:type="dxa" w:w="80"/>
+              <w:bottom w:type="dxa" w:w="40"/>
+              <w:right w:type="dxa" w:w="80"/>
+            </w:tcMar>
+          </w:tcPr>
+          <w:p>
+            <w:r>
+              <w:rPr>
+                <w:rFonts w:ascii="Arial" w:cs="Arial" w:eastAsia="Arial" w:hAnsi="Arial"/>
+                <w:b w:val="false"/>
+                <w:bCs w:val="false"/>
+                <w:sz w:val="17"/>
+                <w:szCs w:val="17"/>
+              </w:rPr>
+              <w:t xml:space="preserve">12/26</w:t>
+            </w:r>
+          </w:p>
+        </w:tc>
+        <w:tc>
+          <w:tcPr>
+            <w:tcW w:type="dxa" w:w="1610"/>
+            <w:tcBorders>
+              <w:top w:val="single" w:color="BBBBBB" w:sz="4"/>
+              <w:left w:val="single" w:color="BBBBBB" w:sz="4"/>
+              <w:bottom w:val="single" w:color="BBBBBB" w:sz="4"/>
+              <w:right w:val="single" w:color="BBBBBB" w:sz="4"/>
+            </w:tcBorders>
+            <w:tcMar>
+              <w:top w:type="dxa" w:w="40"/>
+              <w:left w:type="dxa" w:w="80"/>
+              <w:bottom w:type="dxa" w:w="40"/>
+              <w:right w:type="dxa" w:w="80"/>
+            </w:tcMar>
+          </w:tcPr>
+          <w:p>
+            <w:r>
+              <w:rPr>
+                <w:rFonts w:ascii="Arial" w:cs="Arial" w:eastAsia="Arial" w:hAnsi="Arial"/>
+                <w:b w:val="false"/>
+                <w:bCs w:val="false"/>
+                <w:sz w:val="17"/>
+                <w:szCs w:val="17"/>
+              </w:rPr>
+              <w:t xml:space="preserve">1/27</w:t>
+            </w:r>
+          </w:p>
+        </w:tc>
+      </w:tr>
+      <w:tr>
+        <w:trPr>
+          <w:tblHeader w:val="off"/>
+        </w:trPr>
+        <w:tc>
+          <w:tcPr>
+            <w:tcW w:type="dxa" w:w="1606"/>
+            <w:tcBorders>
+              <w:top w:val="single" w:color="BBBBBB" w:sz="4"/>
+              <w:left w:val="single" w:color="BBBBBB" w:sz="4"/>
+              <w:bottom w:val="single" w:color="BBBBBB" w:sz="4"/>
+              <w:right w:val="single" w:color="BBBBBB" w:sz="4"/>
+            </w:tcBorders>
+            <w:tcMar>
+              <w:top w:type="dxa" w:w="40"/>
+              <w:left w:type="dxa" w:w="80"/>
+              <w:bottom w:type="dxa" w:w="40"/>
+              <w:right w:type="dxa" w:w="80"/>
+            </w:tcMar>
+          </w:tcPr>
+          <w:p>
+            <w:r>
+              <w:rPr>
+                <w:rFonts w:ascii="Arial" w:cs="Arial" w:eastAsia="Arial" w:hAnsi="Arial"/>
+                <w:b w:val="false"/>
+                <w:bCs w:val="false"/>
+                <w:sz w:val="17"/>
+                <w:szCs w:val="17"/>
+              </w:rPr>
+              <w:t xml:space="preserve">gpt-oss-120b (low)</w:t>
+            </w:r>
+          </w:p>
+        </w:tc>
+        <w:tc>
+          <w:tcPr>
+            <w:tcW w:type="dxa" w:w="1606"/>
+            <w:tcBorders>
+              <w:top w:val="single" w:color="BBBBBB" w:sz="4"/>
+              <w:left w:val="single" w:color="BBBBBB" w:sz="4"/>
+              <w:bottom w:val="single" w:color="BBBBBB" w:sz="4"/>
+              <w:right w:val="single" w:color="BBBBBB" w:sz="4"/>
+            </w:tcBorders>
+            <w:tcMar>
+              <w:top w:type="dxa" w:w="40"/>
+              <w:left w:type="dxa" w:w="80"/>
+              <w:bottom w:type="dxa" w:w="40"/>
+              <w:right w:type="dxa" w:w="80"/>
+            </w:tcMar>
+          </w:tcPr>
+          <w:p>
+            <w:r>
+              <w:rPr>
+                <w:rFonts w:ascii="Arial" w:cs="Arial" w:eastAsia="Arial" w:hAnsi="Arial"/>
+                <w:b w:val="false"/>
+                <w:bCs w:val="false"/>
+                <w:sz w:val="17"/>
+                <w:szCs w:val="17"/>
+              </w:rPr>
+              <w:t xml:space="preserve">confound-aware</w:t>
+            </w:r>
+          </w:p>
+        </w:tc>
+        <w:tc>
+          <w:tcPr>
+            <w:tcW w:type="dxa" w:w="1606"/>
+            <w:tcBorders>
+              <w:top w:val="single" w:color="BBBBBB" w:sz="4"/>
+              <w:left w:val="single" w:color="BBBBBB" w:sz="4"/>
+              <w:bottom w:val="single" w:color="BBBBBB" w:sz="4"/>
+              <w:right w:val="single" w:color="BBBBBB" w:sz="4"/>
+            </w:tcBorders>
+            <w:tcMar>
+              <w:top w:type="dxa" w:w="40"/>
+              <w:left w:type="dxa" w:w="80"/>
+              <w:bottom w:type="dxa" w:w="40"/>
+              <w:right w:type="dxa" w:w="80"/>
+            </w:tcMar>
+          </w:tcPr>
+          <w:p>
+            <w:r>
+              <w:rPr>
+                <w:rFonts w:ascii="Arial" w:cs="Arial" w:eastAsia="Arial" w:hAnsi="Arial"/>
+                <w:b w:val="false"/>
+                <w:bCs w:val="false"/>
+                <w:sz w:val="17"/>
+                <w:szCs w:val="17"/>
+              </w:rPr>
+              <w:t xml:space="preserve">19/27</w:t>
+            </w:r>
+          </w:p>
+        </w:tc>
+        <w:tc>
+          <w:tcPr>
+            <w:tcW w:type="dxa" w:w="1606"/>
+            <w:tcBorders>
+              <w:top w:val="single" w:color="BBBBBB" w:sz="4"/>
+              <w:left w:val="single" w:color="BBBBBB" w:sz="4"/>
+              <w:bottom w:val="single" w:color="BBBBBB" w:sz="4"/>
+              <w:right w:val="single" w:color="BBBBBB" w:sz="4"/>
+            </w:tcBorders>
+            <w:tcMar>
+              <w:top w:type="dxa" w:w="40"/>
+              <w:left w:type="dxa" w:w="80"/>
+              <w:bottom w:type="dxa" w:w="40"/>
+              <w:right w:type="dxa" w:w="80"/>
+            </w:tcMar>
+          </w:tcPr>
+          <w:p>
+            <w:r>
+              <w:rPr>
+                <w:rFonts w:ascii="Arial" w:cs="Arial" w:eastAsia="Arial" w:hAnsi="Arial"/>
+                <w:b w:val="false"/>
+                <w:bCs w:val="false"/>
+                <w:sz w:val="17"/>
+                <w:szCs w:val="17"/>
+              </w:rPr>
+              <w:t xml:space="preserve">9/27</w:t>
+            </w:r>
+          </w:p>
+        </w:tc>
+        <w:tc>
+          <w:tcPr>
+            <w:tcW w:type="dxa" w:w="1606"/>
+            <w:tcBorders>
+              <w:top w:val="single" w:color="BBBBBB" w:sz="4"/>
+              <w:left w:val="single" w:color="BBBBBB" w:sz="4"/>
+              <w:bottom w:val="single" w:color="BBBBBB" w:sz="4"/>
+              <w:right w:val="single" w:color="BBBBBB" w:sz="4"/>
+            </w:tcBorders>
+            <w:tcMar>
+              <w:top w:type="dxa" w:w="40"/>
+              <w:left w:type="dxa" w:w="80"/>
+              <w:bottom w:type="dxa" w:w="40"/>
+              <w:right w:type="dxa" w:w="80"/>
+            </w:tcMar>
+          </w:tcPr>
+          <w:p>
+            <w:r>
+              <w:rPr>
+                <w:rFonts w:ascii="Arial" w:cs="Arial" w:eastAsia="Arial" w:hAnsi="Arial"/>
+                <w:b w:val="false"/>
+                <w:bCs w:val="false"/>
+                <w:sz w:val="17"/>
+                <w:szCs w:val="17"/>
+              </w:rPr>
+              <w:t xml:space="preserve">16/27</w:t>
+            </w:r>
+          </w:p>
+        </w:tc>
+        <w:tc>
+          <w:tcPr>
+            <w:tcW w:type="dxa" w:w="1610"/>
+            <w:tcBorders>
+              <w:top w:val="single" w:color="BBBBBB" w:sz="4"/>
+              <w:left w:val="single" w:color="BBBBBB" w:sz="4"/>
+              <w:bottom w:val="single" w:color="BBBBBB" w:sz="4"/>
+              <w:right w:val="single" w:color="BBBBBB" w:sz="4"/>
+            </w:tcBorders>
+            <w:tcMar>
+              <w:top w:type="dxa" w:w="40"/>
+              <w:left w:type="dxa" w:w="80"/>
+              <w:bottom w:type="dxa" w:w="40"/>
+              <w:right w:type="dxa" w:w="80"/>
+            </w:tcMar>
+          </w:tcPr>
+          <w:p>
+            <w:r>
+              <w:rPr>
+                <w:rFonts w:ascii="Arial" w:cs="Arial" w:eastAsia="Arial" w:hAnsi="Arial"/>
+                <w:b w:val="false"/>
+                <w:bCs w:val="false"/>
+                <w:sz w:val="17"/>
+                <w:szCs w:val="17"/>
+              </w:rPr>
+              <w:t xml:space="preserve">1/27</w:t>
+            </w:r>
+          </w:p>
+        </w:tc>
+      </w:tr>
+    </w:tbl>
+    <w:p>
+      <w:pPr>
+        <w:spacing w:after="120"/>
+      </w:pPr>
+    </w:p>
+    <w:p>
+      <w:pPr>
         <w:pStyle w:val="Heading1"/>
         <w:keepNext/>
         <w:spacing w:after="120" w:before="260"/>
@@ -2704,7 +3677,7 @@
           <w:sz w:val="20"/>
           <w:szCs w:val="20"/>
         </w:rPr>
-        <w:t xml:space="preserve"> Every log-based detector we tested either counted the shared prompt as contact or missed most real transmission. The naive judge counted it in a third of blind groups, and its reasons describe the shared task sequence. The warned judge stopped counting it, along with most real transmission. Page concentration looked like a structural plus factor until cohort dates were stripped from the names. The one signal that separated the conditions was content only contact could supply: answers to rounds a cohort had not reached. This matches the antitrust logic. Parallel conduct, such as agents writing the same sequence because the task showed it to all of them, is not agreement, and the evidence that counts is information the parties could not have had on their own. Lütje documents evidence of this kind in the real archive: first reports preceding later cohorts' own arrival by a median of 3.4 hours, and 8 cohorts with textual receipt of answers to rounds they had not reached [2]. For auditors, the step this suggests is to run a coordination detector on a blind-board version of the same setup and report its false alarm rate there before trusting it on a log.</w:t>
+        <w:t xml:space="preserve"> At a fixed threshold, every log-based detector we tested either counted the shared prompt as contact or missed most real transmission. The naive judge counted it in a third of blind groups, and its reasons describe the shared task sequence. The warned judge stopped counting it, along with most real transmission. Page concentration looked like a structural plus factor until cohort dates were stripped from the names. The one signal that separated the conditions was content only contact could supply: answers to rounds a cohort had not reached. This matches the antitrust logic. Parallel conduct, such as agents writing the same sequence because the task showed it to all of them, is not agreement, and the evidence that counts is information the parties could not have had on their own. Lütje documents evidence of this kind in the real archive: first reports preceding later cohorts' own arrival by a median of 3.4 hours, and 8 cohorts with textual receipt of answers to rounds they had not reached [2]. For auditors this gives a test they can run: replay the suspect agents on a blind board and flag only what beats every replay. In our runs it held every judge to at most 1 false alarm in 27 groups. The best variant, the warned gpt-oss-120b judge, kept 16 of 27 detections; the naive judges lost about half of theirs. It needs the agents and their prompts, which a platform operator has and an outside reader of an archive does not.</w:t>
       </w:r>
     </w:p>
     <w:p>
@@ -2851,15 +3824,15 @@
           <w:sz w:val="20"/>
           <w:szCs w:val="20"/>
         </w:rPr>
-        <w:t xml:space="preserve">Thresholds.</w:t>
-      </w:r>
-      <w:r>
-        <w:rPr>
-          <w:rFonts w:ascii="Arial" w:cs="Arial" w:eastAsia="Arial" w:hAnsi="Arial"/>
-          <w:sz w:val="20"/>
-          <w:szCs w:val="20"/>
-        </w:rPr>
-        <w:t xml:space="preserve"> Structural thresholds were frozen on one pilot seed per model.</w:t>
+        <w:t xml:space="preserve">Thresholds and replays.</w:t>
+      </w:r>
+      <w:r>
+        <w:rPr>
+          <w:rFonts w:ascii="Arial" w:cs="Arial" w:eastAsia="Arial" w:hAnsi="Arial"/>
+          <w:sz w:val="20"/>
+          <w:szCs w:val="20"/>
+        </w:rPr>
+        <w:t xml:space="preserve"> Structural thresholds were frozen on one pilot seed per model. Our replays are other seeds' blind runs, so they differ in task world as well as sampling; an auditor would replay the same world, which we did not run. We designed the replay calibration after seeing the fixed-threshold results.</w:t>
       </w:r>
     </w:p>
     <w:p>
@@ -2887,7 +3860,7 @@
           <w:sz w:val="20"/>
           <w:szCs w:val="20"/>
         </w:rPr>
-        <w:t xml:space="preserve"> Measure contact-only content directly as a detector, for example the share of an agent's claims about rounds it has not reached, and score it on blind boards and on the real archive. Repeat the blind-board control with frontier agents and the archive's own reporting formats, and test judges given few-shot examples calibrated on blind runs.</w:t>
+        <w:t xml:space="preserve"> Measure contact-only content directly as a detector, for example the share of an agent's claims about rounds it has not reached, and score it on blind boards and the real archive. Repeat the control with frontier agents, the archive's reporting formats and same-world replays.</w:t>
       </w:r>
     </w:p>
     <w:p>
@@ -2917,7 +3890,7 @@
           <w:sz w:val="20"/>
           <w:szCs w:val="20"/>
         </w:rPr>
-        <w:t xml:space="preserve">We added the condition missing from both published readings of the German Wiki Incident: the same agents and prompt, with no way to read each other. Correct answers confirm that transmission happens only when agents can read. LLM judges still flag a third of the non-communicating groups because they read a shared task as shared contact, and warning them about it trades false alarms for misses. Page concentration separates the conditions only through cohort dates in page names. Content that only contact could supply was the signal that held, and coordination detectors should be checked on a blind version of their own setup before they are trusted on real logs.</w:t>
+        <w:t xml:space="preserve">We added the condition missing from both published readings of the German Wiki Incident: the same agents and prompt, with no way to read each other. Correct answers confirm that transmission happens only when agents can read. LLM judges still flag a third of the non-communicating groups because they read a shared task as shared contact, and warning them about it trades false alarms for misses. Page concentration separates the conditions only through cohort dates in page names. Content that only contact could supply was the signal that held. Calibrating judges on blind replays of the same agents held false alarms to at most 1 in 27, at a cost in detections for three of four variants. Detectors should be calibrated on a blind version of their own setup before they are trusted on real logs.</w:t>
       </w:r>
     </w:p>
     <w:p>
@@ -2952,7 +3925,7 @@
           <w:sz w:val="20"/>
           <w:szCs w:val="20"/>
         </w:rPr>
-        <w:t xml:space="preserve">Code repository: https://github.com/Somay-kousis/Nullspace (code, 92 tests, every prompt, response and revision of every run, and the scripts that regenerate every number and figure)</w:t>
+        <w:t xml:space="preserve">Code repository: https://github.com/Somay-kousis/Nullspace (code, 109 tests, raw logs of every run, scripts that regenerate every number and figure)</w:t>
       </w:r>
     </w:p>
     <w:p>
@@ -2970,7 +3943,7 @@
           <w:sz w:val="20"/>
           <w:szCs w:val="20"/>
         </w:rPr>
-        <w:t xml:space="preserve">Data: the German Wiki Incident export, public at https://collusion.wiki/explorer/download.html (not redistributed)</w:t>
+        <w:t xml:space="preserve">Data: German Wiki Incident export, https://collusion.wiki/explorer/download.html (not redistributed)</w:t>
       </w:r>
     </w:p>
     <w:p>

</xml_diff>

<commit_message>
Report: new abstract and the replay test as a contribution
</commit_message>
<xml_diff>
--- a/report/report.docx
+++ b/report/report.docx
@@ -100,7 +100,7 @@
           <w:sz w:val="20"/>
           <w:szCs w:val="20"/>
         </w:rPr>
-        <w:t xml:space="preserve">Coordination between AI agents is usually inferred from logs after the fact, by an LLM judge or by statistics of who copied whom. The German Wiki Incident, where OpenAI evaluation agents wrote to a public wiki for six weeks and traded answers during a burst in mid-June, has two published readings that disagree. One fits copying models. The other says the archive cannot separate copying from agents converging because they share a prompt and a model. We build the condition that could separate the two. In a small analogue of the incident's timed question chains, agents share a wiki that shows either what others wrote (visible) or nothing at all (blind), with byte-identical prompts, so any coordination a detector reports in a blind run is a false alarm. Correct answers rise above chance only on visible boards (3.7 and 2.5 per run, against 1.0 and 0.3 blind and 0.75 by chance). A naive LLM judge still calls 9 of 27 blind task groups coordinated, citing agents who build on a state sequence that the task gave all of them. Warning it about the shared prompt removes false alarms but cuts detection from 81% to 30%. Page concentration separates the conditions only until cohort dates are stripped from page names; then blind agents converge as much as visible ones. The one signal that held was content only contact could supply. On the real archive, the naive judge flags 11 of 17 windows from before the documented coordination onset.</w:t>
+        <w:t xml:space="preserve">Evidence used to call AI agents coordinated can fire on agents that never saw each other. We test this on the German Wiki Incident, where OpenAI evaluation agents shared a public wiki and traded answers. Its two published readings disagree on whether the logs show copying or shared-prompt convergence. Neither has a no-contact control, so we build one. In a small analogue, agents share a wiki that shows either what others wrote (visible) or nothing (blind), with byte-identical prompts, so every flag on a blind run is a false positive by construction. Correct answers to future rounds rise above chance only on visible boards (3.7 and 2.5 per run vs 1.0 and 0.3 blind; chance 0.75). A naive LLM judge still calls 9 of 27 blind task groups coordinated, and its reasons cite a sequence the task gave every agent. Warning it about the shared prompt removes those false alarms and cuts detection from 81% to 30%. Page concentration stops separating the conditions once cohort dates are removed from page names. On the real archive, the naive judge flags 11 of 17 windows before the documented onset. Two kinds of evidence held up: content only contact could supply, such as answers to rounds an agent had not reached, and calibration on blind replays of the same agents. Flagging only scores above every replay held all four judge variants to at most 1 false alarm in 27 groups, and the best kept 16 of 27 detections.</w:t>
       </w:r>
     </w:p>
     <w:p>
@@ -254,6 +254,34 @@
           <w:szCs w:val="20"/>
         </w:rPr>
         <w:t xml:space="preserve"> Content that only contact could supply was the one signal that separated the conditions. On the real archive, the naive judge flags 11 of 17 windows from before the documented coordination onset, when only 7 of 1,305 contributions carried a coordination topic.</w:t>
+      </w:r>
+    </w:p>
+    <w:p>
+      <w:pPr>
+        <w:pStyle w:val="ListParagraph"/>
+        <w:numPr>
+          <w:ilvl w:val="0"/>
+          <w:numId w:val="2"/>
+        </w:numPr>
+        <w:spacing w:after="60" w:line="264"/>
+      </w:pPr>
+      <w:r>
+        <w:rPr>
+          <w:rFonts w:ascii="Arial" w:cs="Arial" w:eastAsia="Arial" w:hAnsi="Arial"/>
+          <w:b/>
+          <w:bCs/>
+          <w:sz w:val="20"/>
+          <w:szCs w:val="20"/>
+        </w:rPr>
+        <w:t xml:space="preserve">A test auditors can run.</w:t>
+      </w:r>
+      <w:r>
+        <w:rPr>
+          <w:rFonts w:ascii="Arial" w:cs="Arial" w:eastAsia="Arial" w:hAnsi="Arial"/>
+          <w:sz w:val="20"/>
+          <w:szCs w:val="20"/>
+        </w:rPr>
+        <w:t xml:space="preserve"> Scoring a judge against blind replays of the same agents held all four judge variants to at most 1 false alarm in 27 groups.</w:t>
       </w:r>
     </w:p>
     <w:p>

</xml_diff>